<commit_message>
Complete KidSpark handoff documentation
</commit_message>
<xml_diff>
--- a/docs/handoff/KidSpark_Project_Overview.docx
+++ b/docs/handoff/KidSpark_Project_Overview.docx
@@ -18,7 +18,7 @@
         <w:t>Project period:</w:t>
       </w:r>
       <w:r>
-        <w:t xml:space="preserve"> February-August 2026  </w:t>
+        <w:t xml:space="preserve"> February-August 2026&lt;br&gt;</w:t>
       </w:r>
     </w:p>
     <w:p>
@@ -29,7 +29,7 @@
         <w:t>Prepared for:</w:t>
       </w:r>
       <w:r>
-        <w:t xml:space="preserve"> The Jacobs Institute for Innovation in Education at the University of San Diego  </w:t>
+        <w:t xml:space="preserve"> The Jacobs Institute for Innovation in Education at the University of San Diego&lt;br&gt;</w:t>
       </w:r>
     </w:p>
     <w:p>
@@ -40,7 +40,7 @@
         <w:t>Audience:</w:t>
       </w:r>
       <w:r>
-        <w:t xml:space="preserve"> Sponsors, educators, researchers, project collaborators, and technical teams  </w:t>
+        <w:t xml:space="preserve"> Sponsors, educators, researchers, project collaborators, and technical teams</w:t>
       </w:r>
     </w:p>
     <w:p>
@@ -159,9 +159,11 @@
     </w:p>
     <w:p>
       <w:pPr>
-        <w:pStyle w:val="ListNumber"/>
         <w:ind w:left="547" w:hanging="259"/>
       </w:pPr>
+      <w:r>
+        <w:t xml:space="preserve">1.  </w:t>
+      </w:r>
       <w:r>
         <w:rPr>
           <w:b/>
@@ -174,9 +176,11 @@
     </w:p>
     <w:p>
       <w:pPr>
-        <w:pStyle w:val="ListNumber"/>
         <w:ind w:left="547" w:hanging="259"/>
       </w:pPr>
+      <w:r>
+        <w:t xml:space="preserve">2.  </w:t>
+      </w:r>
       <w:r>
         <w:rPr>
           <w:b/>
@@ -189,9 +193,11 @@
     </w:p>
     <w:p>
       <w:pPr>
-        <w:pStyle w:val="ListNumber"/>
         <w:ind w:left="547" w:hanging="259"/>
       </w:pPr>
+      <w:r>
+        <w:t xml:space="preserve">3.  </w:t>
+      </w:r>
       <w:r>
         <w:rPr>
           <w:b/>
@@ -821,9 +827,11 @@
     </w:p>
     <w:p>
       <w:pPr>
-        <w:pStyle w:val="ListNumber"/>
         <w:ind w:left="547" w:hanging="259"/>
       </w:pPr>
+      <w:r>
+        <w:t xml:space="preserve">1.  </w:t>
+      </w:r>
       <w:r>
         <w:rPr>
           <w:b/>
@@ -836,9 +844,11 @@
     </w:p>
     <w:p>
       <w:pPr>
-        <w:pStyle w:val="ListNumber"/>
         <w:ind w:left="547" w:hanging="259"/>
       </w:pPr>
+      <w:r>
+        <w:t xml:space="preserve">2.  </w:t>
+      </w:r>
       <w:r>
         <w:rPr>
           <w:b/>
@@ -851,9 +861,11 @@
     </w:p>
     <w:p>
       <w:pPr>
-        <w:pStyle w:val="ListNumber"/>
         <w:ind w:left="547" w:hanging="259"/>
       </w:pPr>
+      <w:r>
+        <w:t xml:space="preserve">3.  </w:t>
+      </w:r>
       <w:r>
         <w:rPr>
           <w:b/>
@@ -866,9 +878,11 @@
     </w:p>
     <w:p>
       <w:pPr>
-        <w:pStyle w:val="ListNumber"/>
         <w:ind w:left="547" w:hanging="259"/>
       </w:pPr>
+      <w:r>
+        <w:t xml:space="preserve">4.  </w:t>
+      </w:r>
       <w:r>
         <w:rPr>
           <w:b/>
@@ -963,7 +977,7 @@
       <w:r>
         <w:drawing>
           <wp:inline xmlns:a="http://schemas.openxmlformats.org/drawingml/2006/main" xmlns:pic="http://schemas.openxmlformats.org/drawingml/2006/picture">
-            <wp:extent cx="5989320" cy="2807494"/>
+            <wp:extent cx="5989320" cy="3407923"/>
             <wp:docPr id="8" name="Picture 8"/>
             <wp:cNvGraphicFramePr>
               <a:graphicFrameLocks noChangeAspect="1"/>
@@ -984,7 +998,7 @@
                   <pic:spPr>
                     <a:xfrm>
                       <a:off x="0" y="0"/>
-                      <a:ext cx="5989320" cy="2807494"/>
+                      <a:ext cx="5989320" cy="3407923"/>
                     </a:xfrm>
                     <a:prstGeom prst="rect"/>
                   </pic:spPr>
@@ -1494,47 +1508,42 @@
     </w:p>
     <w:p>
       <w:pPr>
-        <w:pStyle w:val="ListNumber"/>
         <w:ind w:left="547" w:hanging="259"/>
       </w:pPr>
       <w:r>
-        <w:t>Review and merge the final documentation package.</w:t>
+        <w:t>1.  Review and merge the final documentation package.</w:t>
       </w:r>
     </w:p>
     <w:p>
       <w:pPr>
-        <w:pStyle w:val="ListNumber"/>
         <w:ind w:left="547" w:hanging="259"/>
       </w:pPr>
       <w:r>
-        <w:t>Reauthenticate the GCP operator account and verify the live resource baseline.</w:t>
+        <w:t>2.  Reauthenticate the GCP operator account and verify the live resource baseline.</w:t>
       </w:r>
     </w:p>
     <w:p>
       <w:pPr>
-        <w:pStyle w:val="ListNumber"/>
         <w:ind w:left="547" w:hanging="259"/>
       </w:pPr>
       <w:r>
-        <w:t>Confirm Cloud SQL corpus table and embedding counts.</w:t>
+        <w:t>3.  Confirm Cloud SQL corpus table and embedding counts.</w:t>
       </w:r>
     </w:p>
     <w:p>
       <w:pPr>
-        <w:pStyle w:val="ListNumber"/>
         <w:ind w:left="547" w:hanging="259"/>
       </w:pPr>
       <w:r>
-        <w:t>Run the saved-output end-to-end regression in the approved deployment revision.</w:t>
+        <w:t>4.  Run the saved-output end-to-end regression in the approved deployment revision.</w:t>
       </w:r>
     </w:p>
     <w:p>
       <w:pPr>
-        <w:pStyle w:val="ListNumber"/>
         <w:ind w:left="547" w:hanging="259"/>
       </w:pPr>
       <w:r>
-        <w:t>Schedule a separately authorized production deployment only if runtime changes are included.</w:t>
+        <w:t>5.  Schedule a separately authorized production deployment only if runtime changes are included.</w:t>
       </w:r>
     </w:p>
     <w:p>
@@ -1547,56 +1556,50 @@
     </w:p>
     <w:p>
       <w:pPr>
-        <w:pStyle w:val="ListNumber"/>
         <w:ind w:left="547" w:hanging="259"/>
       </w:pPr>
       <w:r>
-        <w:t>Persist sessions and generated artifacts in managed storage.</w:t>
+        <w:t>1.  Persist sessions and generated artifacts in managed storage.</w:t>
       </w:r>
     </w:p>
     <w:p>
       <w:pPr>
-        <w:pStyle w:val="ListNumber"/>
         <w:ind w:left="547" w:hanging="259"/>
       </w:pPr>
       <w:r>
-        <w:t>Move long-running Rodin/Bang/physicalization tasks to a durable task queue.</w:t>
+        <w:t>2.  Move long-running Rodin/Bang/physicalization tasks to a durable task queue.</w:t>
       </w:r>
     </w:p>
     <w:p>
       <w:pPr>
-        <w:pStyle w:val="ListNumber"/>
         <w:ind w:left="547" w:hanging="259"/>
       </w:pPr>
       <w:r>
-        <w:t>Add institutional authentication and role-based access.</w:t>
+        <w:t>3.  Add institutional authentication and role-based access.</w:t>
       </w:r>
     </w:p>
     <w:p>
       <w:pPr>
-        <w:pStyle w:val="ListNumber"/>
         <w:ind w:left="547" w:hanging="259"/>
       </w:pPr>
       <w:r>
-        <w:t>Define privacy, retention, deletion, copyright, and acceptable-use policies.</w:t>
+        <w:t>4.  Define privacy, retention, deletion, copyright, and acceptable-use policies.</w:t>
       </w:r>
     </w:p>
     <w:p>
       <w:pPr>
-        <w:pStyle w:val="ListNumber"/>
         <w:ind w:left="547" w:hanging="259"/>
       </w:pPr>
       <w:r>
-        <w:t>Automate build, test, secret scanning, deployment, smoke testing, and rollback.</w:t>
+        <w:t>5.  Automate build, test, secret scanning, deployment, smoke testing, and rollback.</w:t>
       </w:r>
     </w:p>
     <w:p>
       <w:pPr>
-        <w:pStyle w:val="ListNumber"/>
         <w:ind w:left="547" w:hanging="259"/>
       </w:pPr>
       <w:r>
-        <w:t>Add dashboards for model latency, fallback use, retrieval quality, segment recovery, planner status, and document failures.</w:t>
+        <w:t>6.  Add dashboards for model latency, fallback use, retrieval quality, segment recovery, planner status, and document failures.</w:t>
       </w:r>
     </w:p>
     <w:p>
@@ -1609,65 +1612,58 @@
     </w:p>
     <w:p>
       <w:pPr>
-        <w:pStyle w:val="ListNumber"/>
         <w:ind w:left="547" w:hanging="259"/>
       </w:pPr>
       <w:r>
-        <w:t>Evaluate lesson quality with teachers across grade bands.</w:t>
+        <w:t>1.  Evaluate lesson quality with teachers across grade bands.</w:t>
       </w:r>
     </w:p>
     <w:p>
       <w:pPr>
-        <w:pStyle w:val="ListNumber"/>
         <w:ind w:left="547" w:hanging="259"/>
       </w:pPr>
       <w:r>
-        <w:t>Test whether RAG evidence improves planning decisions and reduces preparation time.</w:t>
+        <w:t>2.  Test whether RAG evidence improves planning decisions and reduces preparation time.</w:t>
       </w:r>
     </w:p>
     <w:p>
       <w:pPr>
-        <w:pStyle w:val="ListNumber"/>
         <w:ind w:left="547" w:hanging="259"/>
       </w:pPr>
       <w:r>
-        <w:t>Expand the validated block catalog and inventory profiles.</w:t>
+        <w:t>3.  Expand the validated block catalog and inventory profiles.</w:t>
       </w:r>
     </w:p>
     <w:p>
       <w:pPr>
-        <w:pStyle w:val="ListNumber"/>
         <w:ind w:left="547" w:hanging="259"/>
       </w:pPr>
       <w:r>
-        <w:t>Study physical stability and student ability to follow generated instructions.</w:t>
+        <w:t>4.  Study physical stability and student ability to follow generated instructions.</w:t>
       </w:r>
     </w:p>
     <w:p>
       <w:pPr>
-        <w:pStyle w:val="ListNumber"/>
         <w:ind w:left="547" w:hanging="259"/>
       </w:pPr>
       <w:r>
-        <w:t>Add editable slide export and accessibility review.</w:t>
+        <w:t>5.  Add editable slide export and accessibility review.</w:t>
       </w:r>
     </w:p>
     <w:p>
       <w:pPr>
-        <w:pStyle w:val="ListNumber"/>
         <w:ind w:left="547" w:hanging="259"/>
       </w:pPr>
       <w:r>
-        <w:t>Develop corpus governance and visual-embedding evaluation.</w:t>
+        <w:t>6.  Develop corpus governance and visual-embedding evaluation.</w:t>
       </w:r>
     </w:p>
     <w:p>
       <w:pPr>
-        <w:pStyle w:val="ListNumber"/>
         <w:ind w:left="547" w:hanging="259"/>
       </w:pPr>
       <w:r>
-        <w:t>Measure how effectively students connect story themes, vocabulary, engineering, and reflection.</w:t>
+        <w:t>7.  Measure how effectively students connect story themes, vocabulary, engineering, and reflection.</w:t>
       </w:r>
     </w:p>
     <w:p>
@@ -1716,12 +1712,17 @@
     </w:p>
     <w:p>
       <w:r>
-        <w:t>Cla-Petra Omaku worked on the application backend, with a particular focus on retrieval. She designed the RAG pipeline and the embedding/vectorization workflow for previous student plans and lesson resources. Her work established how educational evidence could be processed, stored, and retrieved to support the teacher-planning conversation.</w:t>
+        <w:t>Cla-Petra Omaku played a central role in designing the application's data and retrieval architecture. Her backend work focused on the retrieval-augmented generation pipeline that enables KidSpark AI to draw from previous student plans, lesson resources, standards, and instructional materials during the teacher-planning conversation. She helped define how educational content should be divided into meaningful units, embedded, vectorized, stored, and retrieved so that recommendations could be grounded in relevant evidence instead of relying solely on general model knowledge.</w:t>
       </w:r>
     </w:p>
     <w:p>
       <w:r>
-        <w:t>Cla-Petra also contributed to the overall backend design and helped conceptualize the frontend experience. Her retrieval work made the teacher coach more than a generic conversational model by creating a path for prior KidSpark materials and standards to inform new planning decisions.</w:t>
+        <w:t>Her work also helped establish the separation between corpus ingestion and runtime retrieval. This included shaping how processed educational materials, metadata, grade-band information, embeddings, and source references could move through the system and support future corpus expansion. That foundation gives the planning coach a practical path for providing context-aware suggestions while retaining traceability to prior KidSpark resources.</w:t>
+      </w:r>
+    </w:p>
+    <w:p>
+      <w:r>
+        <w:t>Cla-Petra also contributed to the broader backend architecture and helped conceptualize the frontend experience. Her work connected data engineering, educational evidence, and conversational AI, making retrieval an integral part of lesson planning rather than a disconnected search feature.</w:t>
       </w:r>
     </w:p>
     <w:p>
@@ -1752,12 +1753,17 @@
     </w:p>
     <w:p>
       <w:r>
-        <w:t>Jacob Tassos worked on the backend 3D design and on the core problem of translating Rodin-generated objects into voxel and instruction representations. He investigated how OBJ geometry could be converted into the voxel structures needed to represent KidSpark/BrickSmart blocks and how those structures could become steps that an agent and teacher could understand.</w:t>
+        <w:t>Jacob Tassos led critical research and implementation work across the project's 3D design and physicalization pipeline. He investigated how continuous OBJ geometry generated by Rodin could be analyzed, segmented, voxelized, and ultimately represented using the discrete structures required by KidSpark and BrickSmart materials. This work addressed one of the project's most technically challenging problems: converting a visually recognizable 3D object into a representation that could support understandable, sequential construction instructions.</w:t>
       </w:r>
     </w:p>
     <w:p>
       <w:r>
-        <w:t>Jacob developed and refined the project notebooks, including segmentation inspection, voxelization, contact reasoning, and instruction rendering. He contributed to the integration design that moved notebook research into the application and also participated in frontend design. His ability to bridge 3D geometry and actionable human instructions was instrumental to the project's success.</w:t>
+        <w:t>Jacob developed and refined the project's notebooks and supporting Python workflows. His work covered geometry inspection, voxelization, segment visualization, multiview rendering, contact and adjacency reasoning, connector placement, and the generation of incremental build images. These outputs allowed the system to show not only what a finished model should resemble, but also how its component regions accumulate into a build that a teacher and students can follow.</w:t>
+      </w:r>
+    </w:p>
+    <w:p>
+      <w:r>
+        <w:t>He also helped translate experimental notebook work into reusable application components and contributed to the design of the teacher-facing review experience. Jacob's ability to bridge 3D geometry, computational processing, and human-readable instructions was instrumental in turning the project's generated models into actionable classroom materials.</w:t>
       </w:r>
     </w:p>
     <w:p>
@@ -1770,12 +1776,17 @@
     </w:p>
     <w:p>
       <w:r>
-        <w:t>Kim Nguyen worked on backend 3D design, segmentation, and the relationship between voxel output and real KidSpark/BrickSmart materials. She studied how the existing blocks work, their dimensions and denominations, the limits of a kit, and the need to prevent generated instructions from requiring unavailable pieces.</w:t>
+        <w:t>Kim Nguyen made essential contributions to the project's 3D backend, segmentation strategy, and physical-build validation. Her work concentrated on ensuring that voxelized output corresponded to the realities of KidSpark and BrickSmart materials rather than remaining an abstract digital approximation. She studied the available block types, dimensions, denominations, connection behavior, and finite contents of a standard classroom kit.</w:t>
       </w:r>
     </w:p>
     <w:p>
       <w:r>
-        <w:t>Kim helped make the voxelization process adhere to strict BrickSmart guidelines. Her work ensured that output regions could map to specific block types and inventory constraints instead of remaining abstract colored cubes. She also contributed to overall backend and frontend design. Her physical-kit and segmentation expertise was instrumental to making the project credible and buildable.</w:t>
+        <w:t>Kim helped define the constraints that govern whether a generated design is actually feasible. Her work informed how voxel regions should map to specific block categories, how segment counts should be controlled, and how proposed builds should be checked against available inventory. This made it possible for the system to distinguish between a model that merely looks plausible and one that can be supported by the pieces available to students.</w:t>
+      </w:r>
+    </w:p>
+    <w:p>
+      <w:r>
+        <w:t>She also contributed to the overall backend architecture, frontend design, and integration of the 3D workflow into the larger application. Her combination of segmentation expertise, kit analysis, and attention to classroom feasibility was foundational to the validated-planning process. Together with Jacob's geometry and instruction work, Kim's contributions transformed generated 3D output into constrained, inspectable, and credible BrickSmart builds.</w:t>
       </w:r>
     </w:p>
     <w:p>
@@ -1788,12 +1799,17 @@
     </w:p>
     <w:p>
       <w:r>
-        <w:t>Mrinalini Nathan served as the project coordinator from The Jacobs Institute for Innovation in Education. She supported access to resources, aligned the team's work with Jacobs Institute leadership, and helped provide backend, frontend, third-party, Rodin, and GCP resources.</w:t>
+        <w:t>Mrinalini Nathan served as the project coordinator from The Jacobs Institute for Innovation in Education and provided the institutional support that allowed the multidisciplinary team to work effectively. She coordinated access to educational materials, technical resources, backend and frontend expertise, third-party services, Rodin, and Google Cloud infrastructure. Her work helped remove dependencies that could otherwise have delayed experimentation and integration.</w:t>
       </w:r>
     </w:p>
     <w:p>
       <w:r>
-        <w:t>Mrinalini participated in the overall design and requirements process and helped the team navigate institutional goals and dependencies. Her coordination enabled the technical team to focus on delivery while remaining connected to sponsor expectations.</w:t>
+        <w:t>Mrinalini also helped align the team's technical direction with Jacobs Institute leadership and the broader objectives of the KidSpark initiative. She participated in requirements discussions, reviewed the evolving application design, and helped the team understand how research prototypes, sponsor expectations, and practical deliverables needed to fit together.</w:t>
+      </w:r>
+    </w:p>
+    <w:p>
+      <w:r>
+        <w:t>Her coordination was especially important because the project crossed curriculum design, conversational AI, cloud infrastructure, retrieval, 3D generation, and physical computing. By maintaining communication between the technical team, institutional leadership, and project sponsors, Mrinalini helped ensure that the implementation remained connected to the intended educational outcome.</w:t>
       </w:r>
     </w:p>
     <w:p>
@@ -1806,12 +1822,17 @@
     </w:p>
     <w:p>
       <w:r>
-        <w:t>Perla Myers was a project sponsor from The Jacobs Institute. She communicated core KidSpark guidelines and helped define the expected deliverables, scope, and institutional goals. Her guidance kept the work connected to the practical outcomes expected by the KidSpark and Jacobs Institute teams.</w:t>
+        <w:t>Perla Myers served as a project sponsor from The Jacobs Institute and provided the team with essential guidance on the educational purpose, scope, and expected outcomes of the project. She communicated core KidSpark requirements and helped translate the needs of the KidSpark team into concrete project goals and deliverables.</w:t>
       </w:r>
     </w:p>
     <w:p>
       <w:r>
-        <w:t>Perla also supported team coordination and project meetings. Her participation helped translate sponsor priorities into concrete requirements for the application and handoff.</w:t>
+        <w:t>Her guidance shaped important product decisions, including the emphasis on teacher control, the connection between stories and hands-on learning, the need for classroom-ready lesson materials, and the expectation that generated builds remain appropriate for KidSpark resources. This gave the team a consistent educational lens for evaluating technical choices rather than measuring success only by whether individual technologies worked.</w:t>
+      </w:r>
+    </w:p>
+    <w:p>
+      <w:r>
+        <w:t>Perla also supported project coordination, stakeholder discussions, and team meetings throughout development. Her continued involvement helped the team refine priorities, respond to feedback, and keep the application focused on practical value for educators and students.</w:t>
       </w:r>
     </w:p>
     <w:p>
@@ -1824,12 +1845,22 @@
     </w:p>
     <w:p>
       <w:r>
-        <w:t>Yujia Liu served as project lead and was responsible for the overall direction and delivery of the project. She oversaw backend, frontend, 3D, and voxelization work and provided technical and design guidance across implementation decisions.</w:t>
+        <w:t>Yujia Liu served as project lead and guided the overall direction, coordination, and delivery of KidSpark AI. She oversaw work across the backend, frontend, retrieval pipeline, agent experience, 3D generation, voxelization, physical validation, and final application integration. Her leadership was particularly important in a project where several specialized research streams needed to become one coherent product.</w:t>
       </w:r>
     </w:p>
     <w:p>
       <w:r>
-        <w:t>Yujia set expectations for the major elements of the application, coordinated the team, resolved conflicts and integration questions, and kept the work aligned with project goals. She was the main point of contact for the team and communicated progress to sponsors and stakeholders. Her leadership connected the technical streams and drove the final outcome.</w:t>
+        <w:t>Yujia established expectations for the application's major components and guided technical and design decisions as the system evolved. She helped the team resolve cross-functional questions involving educational requirements, system architecture, integration responsibilities, implementation priorities, and the tradeoffs between research flexibility and a reliable teacher experience.</w:t>
+      </w:r>
+    </w:p>
+    <w:p>
+      <w:r>
+        <w:t>As the team's primary point of coordination, Yujia kept contributors aligned around shared goals, managed dependencies and conflicts, and maintained communication with sponsors and stakeholders. She tracked progress across the project, connected decisions made by different technical groups, and ensured that the final outcome reflected the intended scope and quality.</w:t>
+      </w:r>
+    </w:p>
+    <w:p>
+      <w:r>
+        <w:t>Her leadership provided continuity from early conceptual work through the integrated hosted application and final handoff. By keeping the educational, technical, and sponsor perspectives connected, Yujia helped the team turn a collection of ambitious research components into a complete end-to-end system.</w:t>
       </w:r>
     </w:p>
     <w:p>

</xml_diff>